<commit_message>
Add audience-critical content and fix instructor docs
- Lesson 03: conscious choking (FBAO) section + 2 quiz questions
- Lesson 04: burns section (cooling, depth/extent, evac criteria,
  exhaust-pipe scenario), retitled Bleeding, Wounds & Burns
- Lesson 07: helmet removal (full-face moto focus, two-rescuer technique)
- New Module 14: Water & Lightning Emergencies (drowning, cold-water
  immersion 1-10-1, rescue hierarchy, foot entrapment, reverse triage)
- Index: module 14 wired in, counts updated, dynamic quiz-score badges
- Instructor DOCX: neurogenic shock fix, rubric math (0-4 scale),
  missing answer-sheet Q1 row, guideline updates, completion-record language

Co-Authored-By: Claude Fable 5 <noreply@anthropic.com>
</commit_message>
<xml_diff>
--- a/WFA_Curriculum_Overview.docx
+++ b/WFA_Curriculum_Overview.docx
@@ -399,7 +399,7 @@
                 <w:sz w:val="21"/>
                 <w:szCs w:val="21"/>
               </w:rPr>
-              <w:t xml:space="preserve">Certification</w:t>
+              <w:t xml:space="preserve">Course record</w:t>
             </w:r>
           </w:p>
         </w:tc>
@@ -428,7 +428,7 @@
                 <w:sz w:val="21"/>
                 <w:szCs w:val="21"/>
               </w:rPr>
-              <w:t xml:space="preserve">WFA Certificate (2-year validity)</w:t>
+              <w:t xml:space="preserve">Final exam completion recorded with student name, score, and date</w:t>
             </w:r>
           </w:p>
         </w:tc>
@@ -555,7 +555,7 @@
           <w:sz w:val="22"/>
           <w:szCs w:val="22"/>
         </w:rPr>
-        <w:t xml:space="preserve">The Wilderness First Aid (WFA) course is a foundational wilderness medicine certification designed to equip participants with the knowledge and practical skills to assess and manage medical emergencies in remote or austere environments where definitive care and Emergency Medical Services (EMS) may be delayed or unavailable.</w:t>
+        <w:t xml:space="preserve">The Wilderness First Aid (WFA) course is a foundational wilderness medicine course designed to equip participants with the knowledge and practical skills to assess and manage medical emergencies in remote or austere environments where definitive care and Emergency Medical Services (EMS) may be delayed or unavailable.</w:t>
       </w:r>
     </w:p>
     <w:p>
@@ -1083,7 +1083,7 @@
           <w:sz w:val="28"/>
           <w:szCs w:val="28"/>
         </w:rPr>
-        <w:t xml:space="preserve">Certification Requirements</w:t>
+        <w:t xml:space="preserve">Completion Requirements</w:t>
       </w:r>
     </w:p>
     <w:p>
@@ -1097,7 +1097,7 @@
           <w:sz w:val="22"/>
           <w:szCs w:val="22"/>
         </w:rPr>
-        <w:t xml:space="preserve">To receive the WFA Certificate, participants must:</w:t>
+        <w:t xml:space="preserve">To have their course completion recorded, participants must:</w:t>
       </w:r>
     </w:p>
     <w:p>
@@ -10703,7 +10703,7 @@
           <w:sz w:val="22"/>
           <w:szCs w:val="22"/>
         </w:rPr>
-        <w:t xml:space="preserve">Neurovascular assessment: 6 Ps (Pain, Pallor, Pulse, Paresthesia, Paralysis, Pressure)</w:t>
+        <w:t xml:space="preserve">Neurovascular assessment: 6 Ps (Pain, Pallor, Pulse, Paresthesia, Paralysis, Poikilothermia (cold limb))</w:t>
       </w:r>
     </w:p>
     <w:p>

</xml_diff>